<commit_message>
add all syllabus pdf
</commit_message>
<xml_diff>
--- a/Sem-2/SE/Unit 2/Unit-2.docx
+++ b/Sem-2/SE/Unit 2/Unit-2.docx
@@ -96,25 +96,23 @@
           <w:sz w:val="24"/>
           <w:szCs w:val="24"/>
         </w:rPr>
-        <w:t xml:space="preserve"> and Requirements Engineering: Seven distinct tasks of requirement engineering, </w:t>
-      </w:r>
-      <w:proofErr w:type="gramStart"/>
+        <w:t xml:space="preserve"> and Requirements Engineering: Seven distinct tasks of requirement engineering, Gathering functiona</w:t>
+      </w:r>
       <w:r>
         <w:rPr>
           <w:rFonts w:ascii="Times New Roman" w:hAnsi="Times New Roman" w:cs="Times New Roman"/>
           <w:sz w:val="24"/>
           <w:szCs w:val="24"/>
         </w:rPr>
-        <w:t>Gathering</w:t>
-      </w:r>
-      <w:proofErr w:type="gramEnd"/>
+        <w:t>l/non-functional requirements,</w:t>
+      </w:r>
       <w:r>
         <w:rPr>
           <w:rFonts w:ascii="Times New Roman" w:hAnsi="Times New Roman" w:cs="Times New Roman"/>
           <w:sz w:val="24"/>
           <w:szCs w:val="24"/>
         </w:rPr>
-        <w:t xml:space="preserve"> functiona</w:t>
+        <w:t xml:space="preserve"> Create SRS</w:t>
       </w:r>
       <w:r>
         <w:rPr>
@@ -122,51 +120,51 @@
           <w:sz w:val="24"/>
           <w:szCs w:val="24"/>
         </w:rPr>
-        <w:t>l/non-functional requirements,</w:t>
-      </w:r>
-      <w:r>
+        <w:t>.</w:t>
+      </w:r>
+    </w:p>
+    <w:p>
+      <w:pPr>
+        <w:pStyle w:val="TableParagraph"/>
         <w:rPr>
           <w:rFonts w:ascii="Times New Roman" w:hAnsi="Times New Roman" w:cs="Times New Roman"/>
           <w:sz w:val="24"/>
           <w:szCs w:val="24"/>
         </w:rPr>
-        <w:t xml:space="preserve"> Create SRS</w:t>
-      </w:r>
-      <w:r>
+      </w:pPr>
+    </w:p>
+    <w:p>
+      <w:pPr>
         <w:rPr>
           <w:rFonts w:ascii="Times New Roman" w:hAnsi="Times New Roman" w:cs="Times New Roman"/>
           <w:sz w:val="24"/>
           <w:szCs w:val="24"/>
         </w:rPr>
-        <w:t>.</w:t>
-      </w:r>
-    </w:p>
-    <w:p>
-      <w:pPr>
-        <w:pStyle w:val="TableParagraph"/>
+      </w:pPr>
+      <w:r>
+        <w:rPr>
+          <w:rFonts w:ascii="Times New Roman" w:hAnsi="Times New Roman" w:cs="Times New Roman"/>
+          <w:b/>
+          <w:sz w:val="24"/>
+          <w:szCs w:val="24"/>
+        </w:rPr>
+        <w:t>Software Design and Architecture:</w:t>
+      </w:r>
+      <w:r>
         <w:rPr>
           <w:rFonts w:ascii="Times New Roman" w:hAnsi="Times New Roman" w:cs="Times New Roman"/>
           <w:sz w:val="24"/>
           <w:szCs w:val="24"/>
         </w:rPr>
-      </w:pPr>
-    </w:p>
-    <w:p>
-      <w:pPr>
+        <w:t xml:space="preserve"> </w:t>
+      </w:r>
+      <w:r>
         <w:rPr>
           <w:rFonts w:ascii="Times New Roman" w:hAnsi="Times New Roman" w:cs="Times New Roman"/>
           <w:sz w:val="24"/>
           <w:szCs w:val="24"/>
         </w:rPr>
-      </w:pPr>
-      <w:r>
-        <w:rPr>
-          <w:rFonts w:ascii="Times New Roman" w:hAnsi="Times New Roman" w:cs="Times New Roman"/>
-          <w:b/>
-          <w:sz w:val="24"/>
-          <w:szCs w:val="24"/>
-        </w:rPr>
-        <w:t>Software Design and Architecture:</w:t>
+        <w:t xml:space="preserve">Design concepts and design principle, Architectural design, </w:t>
       </w:r>
       <w:r>
         <w:rPr>
@@ -174,7 +172,7 @@
           <w:sz w:val="24"/>
           <w:szCs w:val="24"/>
         </w:rPr>
-        <w:t xml:space="preserve"> </w:t>
+        <w:t>design UML diagrams</w:t>
       </w:r>
       <w:r>
         <w:rPr>
@@ -182,7 +180,7 @@
           <w:sz w:val="24"/>
           <w:szCs w:val="24"/>
         </w:rPr>
-        <w:t xml:space="preserve">Design concepts and design principle, Architectural design, </w:t>
+        <w:t>: (</w:t>
       </w:r>
       <w:r>
         <w:rPr>
@@ -190,7 +188,7 @@
           <w:sz w:val="24"/>
           <w:szCs w:val="24"/>
         </w:rPr>
-        <w:t>design UML diagrams</w:t>
+        <w:t>Use case, class, sequence,</w:t>
       </w:r>
       <w:r>
         <w:rPr>
@@ -198,7 +196,7 @@
           <w:sz w:val="24"/>
           <w:szCs w:val="24"/>
         </w:rPr>
-        <w:t>: (</w:t>
+        <w:t xml:space="preserve"> activity</w:t>
       </w:r>
       <w:r>
         <w:rPr>
@@ -206,7 +204,7 @@
           <w:sz w:val="24"/>
           <w:szCs w:val="24"/>
         </w:rPr>
-        <w:t>Use case, class, sequence,</w:t>
+        <w:t xml:space="preserve"> </w:t>
       </w:r>
       <w:r>
         <w:rPr>
@@ -214,201 +212,185 @@
           <w:sz w:val="24"/>
           <w:szCs w:val="24"/>
         </w:rPr>
-        <w:t xml:space="preserve"> activity</w:t>
-      </w:r>
-      <w:r>
+        <w:t>diagram)</w:t>
+      </w:r>
+    </w:p>
+    <w:p>
+      <w:pPr>
         <w:rPr>
           <w:rFonts w:ascii="Times New Roman" w:hAnsi="Times New Roman" w:cs="Times New Roman"/>
           <w:sz w:val="24"/>
           <w:szCs w:val="24"/>
         </w:rPr>
+      </w:pPr>
+    </w:p>
+    <w:p>
+      <w:pPr>
+        <w:pStyle w:val="Heading1"/>
+        <w:rPr>
+          <w:sz w:val="48"/>
+          <w:szCs w:val="48"/>
+        </w:rPr>
+      </w:pPr>
+      <w:r>
+        <w:rPr>
+          <w:rFonts w:eastAsia="Times New Roman" w:cs="Times New Roman"/>
+          <w:b/>
+          <w:sz w:val="32"/>
+          <w:szCs w:val="32"/>
+        </w:rPr>
+        <w:t>Requirement Engineering</w:t>
+      </w:r>
+      <w:r>
+        <w:rPr>
+          <w:sz w:val="48"/>
+          <w:szCs w:val="48"/>
+        </w:rPr>
         <w:t xml:space="preserve"> </w:t>
       </w:r>
       <w:r>
         <w:rPr>
-          <w:rFonts w:ascii="Times New Roman" w:hAnsi="Times New Roman" w:cs="Times New Roman"/>
+          <w:rFonts w:cs="Times New Roman"/>
+          <w:b/>
+          <w:sz w:val="32"/>
+          <w:szCs w:val="32"/>
+        </w:rPr>
+        <w:t>&amp; Design Concept</w:t>
+      </w:r>
+    </w:p>
+    <w:p>
+      <w:pPr>
+        <w:rPr>
+          <w:lang w:val="en-IN"/>
+        </w:rPr>
+      </w:pPr>
+    </w:p>
+    <w:p>
+      <w:pPr>
+        <w:spacing w:after="240"/>
+        <w:rPr>
+          <w:b/>
+          <w:bCs/>
+          <w:sz w:val="28"/>
+          <w:szCs w:val="28"/>
+          <w:lang w:val="en-IN"/>
+        </w:rPr>
+      </w:pPr>
+      <w:r>
+        <w:rPr>
+          <w:b/>
+          <w:bCs/>
+          <w:sz w:val="28"/>
+          <w:szCs w:val="28"/>
+          <w:lang w:val="en-IN"/>
+        </w:rPr>
+        <w:t>Understanding the Requirements</w:t>
+      </w:r>
+    </w:p>
+    <w:p>
+      <w:pPr>
+        <w:rPr>
+          <w:lang w:val="en-IN"/>
+        </w:rPr>
+      </w:pPr>
+      <w:r>
+        <w:rPr>
+          <w:lang w:val="en-IN"/>
+        </w:rPr>
+        <w:t xml:space="preserve">In software development, </w:t>
+      </w:r>
+      <w:r>
+        <w:rPr>
+          <w:b/>
+          <w:bCs/>
+          <w:lang w:val="en-IN"/>
+        </w:rPr>
+        <w:t>requirements</w:t>
+      </w:r>
+      <w:r>
+        <w:rPr>
+          <w:lang w:val="en-IN"/>
+        </w:rPr>
+        <w:t xml:space="preserve"> describe what a system should do and the constraints under which it must operate. Requirements represent the </w:t>
+      </w:r>
+      <w:r>
+        <w:rPr>
+          <w:b/>
+          <w:bCs/>
+          <w:lang w:val="en-IN"/>
+        </w:rPr>
+        <w:t>needs and expectations of users, customers, and stakeholders</w:t>
+      </w:r>
+      <w:r>
+        <w:rPr>
+          <w:lang w:val="en-IN"/>
+        </w:rPr>
+        <w:t>.</w:t>
+      </w:r>
+    </w:p>
+    <w:p>
+      <w:pPr>
+        <w:rPr>
+          <w:lang w:val="en-IN"/>
+        </w:rPr>
+      </w:pPr>
+      <w:r>
+        <w:rPr>
+          <w:lang w:val="en-IN"/>
+        </w:rPr>
+        <w:t xml:space="preserve">Understanding requirements is the </w:t>
+      </w:r>
+      <w:r>
+        <w:rPr>
+          <w:b/>
+          <w:bCs/>
+          <w:lang w:val="en-IN"/>
+        </w:rPr>
+        <w:t>first and most important step in software engineering</w:t>
+      </w:r>
+      <w:r>
+        <w:rPr>
+          <w:lang w:val="en-IN"/>
+        </w:rPr>
+        <w:t>. If requirements are misunderstood, the final system may not satisfy the user’s needs.</w:t>
+      </w:r>
+    </w:p>
+    <w:p>
+      <w:pPr>
+        <w:rPr>
+          <w:lang w:val="en-IN"/>
+        </w:rPr>
+      </w:pPr>
+      <w:r>
+        <w:rPr>
+          <w:lang w:val="en-IN"/>
+        </w:rPr>
+        <w:t>Requirements are typically divided into two major types.</w:t>
+      </w:r>
+    </w:p>
+    <w:p>
+      <w:pPr>
+        <w:rPr>
+          <w:lang w:val="en-IN"/>
+        </w:rPr>
+      </w:pPr>
+    </w:p>
+    <w:p>
+      <w:pPr>
+        <w:rPr>
+          <w:b/>
+          <w:bCs/>
           <w:sz w:val="24"/>
           <w:szCs w:val="24"/>
-        </w:rPr>
-        <w:t>diagram)</w:t>
-      </w:r>
-    </w:p>
-    <w:p>
-      <w:pPr>
-        <w:rPr>
-          <w:rFonts w:ascii="Times New Roman" w:hAnsi="Times New Roman" w:cs="Times New Roman"/>
+          <w:lang w:val="en-IN"/>
+        </w:rPr>
+      </w:pPr>
+      <w:r>
+        <w:rPr>
+          <w:b/>
+          <w:bCs/>
           <w:sz w:val="24"/>
           <w:szCs w:val="24"/>
-        </w:rPr>
-      </w:pPr>
-    </w:p>
-    <w:p>
-      <w:pPr>
-        <w:pStyle w:val="Heading1"/>
-        <w:rPr>
-          <w:sz w:val="48"/>
-          <w:szCs w:val="48"/>
-        </w:rPr>
-      </w:pPr>
-      <w:r>
-        <w:rPr>
-          <w:rFonts w:eastAsia="Times New Roman" w:cs="Times New Roman"/>
-          <w:b/>
-          <w:sz w:val="32"/>
-          <w:szCs w:val="32"/>
-        </w:rPr>
-        <w:t>Requirement Engineering</w:t>
-      </w:r>
-      <w:r>
-        <w:rPr>
-          <w:sz w:val="48"/>
-          <w:szCs w:val="48"/>
-        </w:rPr>
-        <w:t xml:space="preserve"> </w:t>
-      </w:r>
-      <w:r>
-        <w:rPr>
-          <w:rFonts w:cs="Times New Roman"/>
-          <w:b/>
-          <w:sz w:val="32"/>
-          <w:szCs w:val="32"/>
-        </w:rPr>
-        <w:t>&amp; Design Concept</w:t>
-      </w:r>
-    </w:p>
-    <w:p>
-      <w:pPr>
-        <w:rPr>
-          <w:lang w:val="en-IN"/>
-        </w:rPr>
-      </w:pPr>
-    </w:p>
-    <w:p>
-      <w:pPr>
-        <w:spacing w:after="240"/>
-        <w:rPr>
-          <w:b/>
-          <w:bCs/>
-          <w:sz w:val="28"/>
-          <w:szCs w:val="28"/>
-          <w:lang w:val="en-IN"/>
-        </w:rPr>
-      </w:pPr>
-      <w:r>
-        <w:rPr>
-          <w:b/>
-          <w:bCs/>
-          <w:sz w:val="28"/>
-          <w:szCs w:val="28"/>
-          <w:lang w:val="en-IN"/>
-        </w:rPr>
-        <w:t>Understanding the Requirements</w:t>
-      </w:r>
-    </w:p>
-    <w:p>
-      <w:pPr>
-        <w:rPr>
-          <w:lang w:val="en-IN"/>
-        </w:rPr>
-      </w:pPr>
-      <w:r>
-        <w:rPr>
-          <w:lang w:val="en-IN"/>
-        </w:rPr>
-        <w:t xml:space="preserve">In software development, </w:t>
-      </w:r>
-      <w:r>
-        <w:rPr>
-          <w:b/>
-          <w:bCs/>
-          <w:lang w:val="en-IN"/>
-        </w:rPr>
-        <w:t>requirements</w:t>
-      </w:r>
-      <w:r>
-        <w:rPr>
-          <w:lang w:val="en-IN"/>
-        </w:rPr>
-        <w:t xml:space="preserve"> describe what a system should do and the constraints under which it must operate. Requirements represent the </w:t>
-      </w:r>
-      <w:r>
-        <w:rPr>
-          <w:b/>
-          <w:bCs/>
-          <w:lang w:val="en-IN"/>
-        </w:rPr>
-        <w:t>needs and expectations of users, customers, and stakeholders</w:t>
-      </w:r>
-      <w:r>
-        <w:rPr>
-          <w:lang w:val="en-IN"/>
-        </w:rPr>
-        <w:t>.</w:t>
-      </w:r>
-    </w:p>
-    <w:p>
-      <w:pPr>
-        <w:rPr>
-          <w:lang w:val="en-IN"/>
-        </w:rPr>
-      </w:pPr>
-      <w:r>
-        <w:rPr>
-          <w:lang w:val="en-IN"/>
-        </w:rPr>
-        <w:t xml:space="preserve">Understanding requirements is the </w:t>
-      </w:r>
-      <w:r>
-        <w:rPr>
-          <w:b/>
-          <w:bCs/>
-          <w:lang w:val="en-IN"/>
-        </w:rPr>
-        <w:t>first and most important step in software engineering</w:t>
-      </w:r>
-      <w:r>
-        <w:rPr>
-          <w:lang w:val="en-IN"/>
-        </w:rPr>
-        <w:t>. If requirements are misunderstood, the final system may not satisfy the user’s needs.</w:t>
-      </w:r>
-    </w:p>
-    <w:p>
-      <w:pPr>
-        <w:rPr>
-          <w:lang w:val="en-IN"/>
-        </w:rPr>
-      </w:pPr>
-      <w:r>
-        <w:rPr>
-          <w:lang w:val="en-IN"/>
-        </w:rPr>
-        <w:t>Requirements are typically divided into two major types.</w:t>
-      </w:r>
-    </w:p>
-    <w:p>
-      <w:pPr>
-        <w:rPr>
-          <w:lang w:val="en-IN"/>
-        </w:rPr>
-      </w:pPr>
-    </w:p>
-    <w:p>
-      <w:pPr>
-        <w:rPr>
-          <w:b/>
-          <w:bCs/>
-          <w:sz w:val="24"/>
-          <w:szCs w:val="24"/>
-          <w:lang w:val="en-IN"/>
-        </w:rPr>
-      </w:pPr>
-      <w:r>
-        <w:rPr>
-          <w:b/>
-          <w:bCs/>
-          <w:sz w:val="24"/>
-          <w:szCs w:val="24"/>
           <w:lang w:val="en-IN"/>
         </w:rPr>
         <w:t>Functional Requirements</w:t>
@@ -440,14 +422,24 @@
         </w:rPr>
         <w:t xml:space="preserve">. They define the </w:t>
       </w:r>
-      <w:proofErr w:type="spellStart"/>
-      <w:r>
-        <w:rPr>
-          <w:lang w:val="en-IN"/>
-        </w:rPr>
-        <w:t>behavior</w:t>
-      </w:r>
-      <w:proofErr w:type="spellEnd"/>
+      <w:r>
+        <w:rPr>
+          <w:lang w:val="en-IN"/>
+        </w:rPr>
+        <w:t>beh</w:t>
+      </w:r>
+      <w:r>
+        <w:rPr>
+          <w:lang w:val="en-IN"/>
+        </w:rPr>
+        <w:t>a</w:t>
+      </w:r>
+      <w:r>
+        <w:rPr>
+          <w:lang w:val="en-IN"/>
+        </w:rPr>
+        <w:t>viour</w:t>
+      </w:r>
       <w:r>
         <w:rPr>
           <w:lang w:val="en-IN"/>
@@ -717,7 +709,7 @@
           <w:lang w:val="en-IN"/>
         </w:rPr>
         <w:pict w14:anchorId="3A5F5D55">
-          <v:rect id="_x0000_i1323" style="width:0;height:1.5pt" o:hralign="center" o:hrstd="t" o:hr="t" fillcolor="#a0a0a0" stroked="f"/>
+          <v:rect id="_x0000_i1025" style="width:0;height:1.5pt" o:hralign="center" o:hrstd="t" o:hr="t" fillcolor="#a0a0a0" stroked="f"/>
         </w:pict>
       </w:r>
     </w:p>
@@ -761,16 +753,14 @@
         </w:rPr>
         <w:t xml:space="preserve">identify, </w:t>
       </w:r>
-      <w:proofErr w:type="spellStart"/>
-      <w:r>
-        <w:rPr>
-          <w:b/>
-          <w:bCs/>
-          <w:lang w:val="en-IN"/>
-        </w:rPr>
-        <w:t>analyze</w:t>
-      </w:r>
-      <w:proofErr w:type="spellEnd"/>
+      <w:r>
+        <w:rPr>
+          <w:b/>
+          <w:bCs/>
+          <w:lang w:val="en-IN"/>
+        </w:rPr>
+        <w:t>analyse</w:t>
+      </w:r>
       <w:r>
         <w:rPr>
           <w:b/>
@@ -846,14 +836,6 @@
           <w:lang w:val="en-IN"/>
         </w:rPr>
       </w:pPr>
-      <w:r>
-        <w:rPr>
-          <w:lang w:val="en-IN"/>
-        </w:rPr>
-        <w:pict w14:anchorId="778C468A">
-          <v:rect id="_x0000_i1324" style="width:0;height:1.5pt" o:hralign="center" o:hrstd="t" o:hr="t" fillcolor="#a0a0a0" stroked="f"/>
-        </w:pict>
-      </w:r>
     </w:p>
     <w:p>
       <w:pPr>
@@ -876,6 +858,109 @@
         </w:rPr>
         <w:t>Seven Distinct Tasks of Requirement Engineering</w:t>
       </w:r>
+    </w:p>
+    <w:p>
+      <w:pPr>
+        <w:rPr>
+          <w:lang w:val="en-IN"/>
+        </w:rPr>
+      </w:pPr>
+      <w:r>
+        <w:rPr>
+          <w:lang w:val="en-IN"/>
+        </w:rPr>
+        <w:t xml:space="preserve">1. Inception </w:t>
+      </w:r>
+    </w:p>
+    <w:p>
+      <w:pPr>
+        <w:rPr>
+          <w:lang w:val="en-IN"/>
+        </w:rPr>
+      </w:pPr>
+      <w:r>
+        <w:rPr>
+          <w:lang w:val="en-IN"/>
+        </w:rPr>
+        <w:t>2. Requirement Elicitation</w:t>
+      </w:r>
+    </w:p>
+    <w:p>
+      <w:pPr>
+        <w:rPr>
+          <w:lang w:val="en-IN"/>
+        </w:rPr>
+      </w:pPr>
+      <w:r>
+        <w:rPr>
+          <w:lang w:val="en-IN"/>
+        </w:rPr>
+        <w:t>3. Elaboration</w:t>
+      </w:r>
+    </w:p>
+    <w:p>
+      <w:pPr>
+        <w:rPr>
+          <w:lang w:val="en-IN"/>
+        </w:rPr>
+      </w:pPr>
+      <w:r>
+        <w:rPr>
+          <w:lang w:val="en-IN"/>
+        </w:rPr>
+        <w:t>4. Negotiation</w:t>
+      </w:r>
+    </w:p>
+    <w:p>
+      <w:pPr>
+        <w:rPr>
+          <w:lang w:val="en-IN"/>
+        </w:rPr>
+      </w:pPr>
+      <w:r>
+        <w:rPr>
+          <w:lang w:val="en-IN"/>
+        </w:rPr>
+        <w:lastRenderedPageBreak/>
+        <w:t xml:space="preserve">5. Requirement Specification </w:t>
+      </w:r>
+    </w:p>
+    <w:p>
+      <w:pPr>
+        <w:rPr>
+          <w:lang w:val="en-IN"/>
+        </w:rPr>
+      </w:pPr>
+      <w:r>
+        <w:rPr>
+          <w:lang w:val="en-IN"/>
+        </w:rPr>
+        <w:t>6. Requirement Validation</w:t>
+      </w:r>
+    </w:p>
+    <w:p>
+      <w:pPr>
+        <w:rPr>
+          <w:lang w:val="en-IN"/>
+        </w:rPr>
+      </w:pPr>
+      <w:r>
+        <w:rPr>
+          <w:lang w:val="en-IN"/>
+        </w:rPr>
+        <w:t>7. Requirement Management</w:t>
+      </w:r>
+    </w:p>
+    <w:p>
+      <w:pPr>
+        <w:rPr>
+          <w:b/>
+          <w:bCs/>
+          <w:sz w:val="24"/>
+          <w:szCs w:val="24"/>
+          <w:lang w:val="en-IN"/>
+        </w:rPr>
+      </w:pPr>
     </w:p>
     <w:p>
       <w:pPr>
@@ -952,7 +1037,6 @@
         <w:rPr>
           <w:lang w:val="en-IN"/>
         </w:rPr>
-        <w:lastRenderedPageBreak/>
         <w:t>Stakeholders are identified.</w:t>
       </w:r>
     </w:p>
@@ -1247,16 +1331,14 @@
         </w:rPr>
         <w:t xml:space="preserve">Elaboration involves </w:t>
       </w:r>
-      <w:proofErr w:type="spellStart"/>
-      <w:r>
-        <w:rPr>
-          <w:b/>
-          <w:bCs/>
-          <w:lang w:val="en-IN"/>
-        </w:rPr>
-        <w:t>analyzing</w:t>
-      </w:r>
-      <w:proofErr w:type="spellEnd"/>
+      <w:r>
+        <w:rPr>
+          <w:b/>
+          <w:bCs/>
+          <w:lang w:val="en-IN"/>
+        </w:rPr>
+        <w:t>analysing</w:t>
+      </w:r>
       <w:r>
         <w:rPr>
           <w:b/>
@@ -1780,6 +1862,7 @@
           <w:szCs w:val="24"/>
           <w:lang w:val="en-IN"/>
         </w:rPr>
+        <w:lastRenderedPageBreak/>
         <w:t>7. Requirement Management</w:t>
       </w:r>
     </w:p>
@@ -1901,7 +1984,6 @@
         <w:rPr>
           <w:lang w:val="en-IN"/>
         </w:rPr>
-        <w:lastRenderedPageBreak/>
         <w:t xml:space="preserve">Requirement management helps prevent </w:t>
       </w:r>
       <w:r>
@@ -2064,7 +2146,7 @@
           <w:lang w:val="en-IN"/>
         </w:rPr>
         <w:pict w14:anchorId="5A375F26">
-          <v:rect id="_x0000_i1331" style="width:0;height:1.5pt" o:hralign="center" o:hrstd="t" o:hr="t" fillcolor="#a0a0a0" stroked="f"/>
+          <v:rect id="_x0000_i1027" style="width:0;height:1.5pt" o:hralign="center" o:hrstd="t" o:hr="t" fillcolor="#a0a0a0" stroked="f"/>
         </w:pict>
       </w:r>
     </w:p>
@@ -2089,7 +2171,6 @@
         </w:rPr>
         <w:t xml:space="preserve">Requirement </w:t>
       </w:r>
-      <w:proofErr w:type="spellStart"/>
       <w:r>
         <w:rPr>
           <w:b/>
@@ -2098,9 +2179,8 @@
           <w:szCs w:val="28"/>
           <w:lang w:val="en-IN"/>
         </w:rPr>
-        <w:t>Modeling</w:t>
-      </w:r>
-      <w:proofErr w:type="spellEnd"/>
+        <w:t>Modelling</w:t>
+      </w:r>
     </w:p>
     <w:p>
       <w:pPr>
@@ -2114,14 +2194,12 @@
         </w:rPr>
         <w:t xml:space="preserve">Requirement </w:t>
       </w:r>
-      <w:proofErr w:type="spellStart"/>
-      <w:r>
-        <w:rPr>
-          <w:lang w:val="en-IN"/>
-        </w:rPr>
-        <w:t>modeling</w:t>
-      </w:r>
-      <w:proofErr w:type="spellEnd"/>
+      <w:r>
+        <w:rPr>
+          <w:lang w:val="en-IN"/>
+        </w:rPr>
+        <w:t>modelling</w:t>
+      </w:r>
       <w:r>
         <w:rPr>
           <w:lang w:val="en-IN"/>
@@ -2247,7 +2325,6 @@
         </w:rPr>
         <w:t xml:space="preserve">Scenario-Based </w:t>
       </w:r>
-      <w:proofErr w:type="spellStart"/>
       <w:r>
         <w:rPr>
           <w:b/>
@@ -2256,9 +2333,8 @@
           <w:szCs w:val="24"/>
           <w:lang w:val="en-IN"/>
         </w:rPr>
-        <w:t>Modeling</w:t>
-      </w:r>
-      <w:proofErr w:type="spellEnd"/>
+        <w:t>Modelling</w:t>
+      </w:r>
     </w:p>
     <w:p>
       <w:pPr>
@@ -2272,14 +2348,12 @@
         </w:rPr>
         <w:t xml:space="preserve">Scenario-based </w:t>
       </w:r>
-      <w:proofErr w:type="spellStart"/>
-      <w:r>
-        <w:rPr>
-          <w:lang w:val="en-IN"/>
-        </w:rPr>
-        <w:t>modeling</w:t>
-      </w:r>
-      <w:proofErr w:type="spellEnd"/>
+      <w:r>
+        <w:rPr>
+          <w:lang w:val="en-IN"/>
+        </w:rPr>
+        <w:t>modelling</w:t>
+      </w:r>
       <w:r>
         <w:rPr>
           <w:lang w:val="en-IN"/>
@@ -2348,7 +2422,6 @@
         </w:rPr>
         <w:t xml:space="preserve">Data </w:t>
       </w:r>
-      <w:proofErr w:type="spellStart"/>
       <w:r>
         <w:rPr>
           <w:b/>
@@ -2357,9 +2430,8 @@
           <w:szCs w:val="24"/>
           <w:lang w:val="en-IN"/>
         </w:rPr>
-        <w:t>Modeling</w:t>
-      </w:r>
-      <w:proofErr w:type="spellEnd"/>
+        <w:t>Modelling</w:t>
+      </w:r>
     </w:p>
     <w:p>
       <w:pPr>
@@ -2373,14 +2445,12 @@
         </w:rPr>
         <w:t xml:space="preserve">Data </w:t>
       </w:r>
-      <w:proofErr w:type="spellStart"/>
-      <w:r>
-        <w:rPr>
-          <w:lang w:val="en-IN"/>
-        </w:rPr>
-        <w:t>modeling</w:t>
-      </w:r>
-      <w:proofErr w:type="spellEnd"/>
+      <w:r>
+        <w:rPr>
+          <w:lang w:val="en-IN"/>
+        </w:rPr>
+        <w:t>modelling</w:t>
+      </w:r>
       <w:r>
         <w:rPr>
           <w:lang w:val="en-IN"/>
@@ -2449,7 +2519,6 @@
         </w:rPr>
         <w:t xml:space="preserve">Flow-Oriented </w:t>
       </w:r>
-      <w:proofErr w:type="spellStart"/>
       <w:r>
         <w:rPr>
           <w:b/>
@@ -2458,9 +2527,8 @@
           <w:szCs w:val="24"/>
           <w:lang w:val="en-IN"/>
         </w:rPr>
-        <w:t>Modeling</w:t>
-      </w:r>
-      <w:proofErr w:type="spellEnd"/>
+        <w:t>Modelling</w:t>
+      </w:r>
     </w:p>
     <w:p>
       <w:pPr>
@@ -2474,14 +2542,12 @@
         </w:rPr>
         <w:t xml:space="preserve">Flow-oriented </w:t>
       </w:r>
-      <w:proofErr w:type="spellStart"/>
-      <w:r>
-        <w:rPr>
-          <w:lang w:val="en-IN"/>
-        </w:rPr>
-        <w:t>modeling</w:t>
-      </w:r>
-      <w:proofErr w:type="spellEnd"/>
+      <w:r>
+        <w:rPr>
+          <w:lang w:val="en-IN"/>
+        </w:rPr>
+        <w:t>modelling</w:t>
+      </w:r>
       <w:r>
         <w:rPr>
           <w:lang w:val="en-IN"/>
@@ -2550,7 +2616,6 @@
         </w:rPr>
         <w:t xml:space="preserve">Class-Based </w:t>
       </w:r>
-      <w:proofErr w:type="spellStart"/>
       <w:r>
         <w:rPr>
           <w:b/>
@@ -2559,9 +2624,8 @@
           <w:szCs w:val="24"/>
           <w:lang w:val="en-IN"/>
         </w:rPr>
-        <w:t>Modeling</w:t>
-      </w:r>
-      <w:proofErr w:type="spellEnd"/>
+        <w:t>Modelling</w:t>
+      </w:r>
     </w:p>
     <w:p>
       <w:pPr>
@@ -2575,14 +2639,12 @@
         </w:rPr>
         <w:t xml:space="preserve">Class-based </w:t>
       </w:r>
-      <w:proofErr w:type="spellStart"/>
-      <w:r>
-        <w:rPr>
-          <w:lang w:val="en-IN"/>
-        </w:rPr>
-        <w:t>modeling</w:t>
-      </w:r>
-      <w:proofErr w:type="spellEnd"/>
+      <w:r>
+        <w:rPr>
+          <w:lang w:val="en-IN"/>
+        </w:rPr>
+        <w:t>modelling</w:t>
+      </w:r>
       <w:r>
         <w:rPr>
           <w:lang w:val="en-IN"/>
@@ -2641,7 +2703,6 @@
           <w:lang w:val="en-IN"/>
         </w:rPr>
       </w:pPr>
-      <w:proofErr w:type="spellStart"/>
       <w:r>
         <w:rPr>
           <w:b/>
@@ -2650,9 +2711,9 @@
           <w:szCs w:val="24"/>
           <w:lang w:val="en-IN"/>
         </w:rPr>
-        <w:t>Behavioral</w:t>
-      </w:r>
-      <w:proofErr w:type="spellEnd"/>
+        <w:lastRenderedPageBreak/>
+        <w:t>Behavioural</w:t>
+      </w:r>
       <w:r>
         <w:rPr>
           <w:b/>
@@ -2663,7 +2724,6 @@
         </w:rPr>
         <w:t xml:space="preserve"> </w:t>
       </w:r>
-      <w:proofErr w:type="spellStart"/>
       <w:r>
         <w:rPr>
           <w:b/>
@@ -2672,38 +2732,33 @@
           <w:szCs w:val="24"/>
           <w:lang w:val="en-IN"/>
         </w:rPr>
-        <w:t>Modeling</w:t>
-      </w:r>
-      <w:proofErr w:type="spellEnd"/>
-    </w:p>
-    <w:p>
-      <w:pPr>
-        <w:rPr>
-          <w:lang w:val="en-IN"/>
-        </w:rPr>
-      </w:pPr>
-      <w:proofErr w:type="spellStart"/>
-      <w:r>
-        <w:rPr>
-          <w:lang w:val="en-IN"/>
-        </w:rPr>
-        <w:t>Behavioral</w:t>
-      </w:r>
-      <w:proofErr w:type="spellEnd"/>
+        <w:t>Modelling</w:t>
+      </w:r>
+    </w:p>
+    <w:p>
+      <w:pPr>
+        <w:rPr>
+          <w:lang w:val="en-IN"/>
+        </w:rPr>
+      </w:pPr>
+      <w:r>
+        <w:rPr>
+          <w:lang w:val="en-IN"/>
+        </w:rPr>
+        <w:t>Behavioural</w:t>
+      </w:r>
       <w:r>
         <w:rPr>
           <w:lang w:val="en-IN"/>
         </w:rPr>
         <w:t xml:space="preserve"> </w:t>
       </w:r>
-      <w:proofErr w:type="spellStart"/>
-      <w:r>
-        <w:rPr>
-          <w:lang w:val="en-IN"/>
-        </w:rPr>
-        <w:t>modeling</w:t>
-      </w:r>
-      <w:proofErr w:type="spellEnd"/>
+      <w:r>
+        <w:rPr>
+          <w:lang w:val="en-IN"/>
+        </w:rPr>
+        <w:t>modelling</w:t>
+      </w:r>
       <w:r>
         <w:rPr>
           <w:lang w:val="en-IN"/>
@@ -2800,7 +2855,7 @@
           <w:lang w:val="en-IN"/>
         </w:rPr>
         <w:pict w14:anchorId="179DAB23">
-          <v:rect id="_x0000_i1336" style="width:0;height:1.5pt" o:hralign="center" o:hrstd="t" o:hr="t" fillcolor="#a0a0a0" stroked="f"/>
+          <v:rect id="_x0000_i1028" style="width:0;height:1.5pt" o:hralign="center" o:hrstd="t" o:hr="t" fillcolor="#a0a0a0" stroked="f"/>
         </w:pict>
       </w:r>
     </w:p>
@@ -2823,7 +2878,6 @@
           <w:szCs w:val="28"/>
           <w:lang w:val="en-IN"/>
         </w:rPr>
-        <w:lastRenderedPageBreak/>
         <w:t>Requirement Specification</w:t>
       </w:r>
     </w:p>
@@ -3600,6 +3654,7 @@
         <w:rPr>
           <w:lang w:val="en-IN"/>
         </w:rPr>
+        <w:lastRenderedPageBreak/>
         <w:t>Reduces development errors</w:t>
       </w:r>
     </w:p>
@@ -3614,7 +3669,7 @@
           <w:lang w:val="en-IN"/>
         </w:rPr>
         <w:pict w14:anchorId="1D376023">
-          <v:rect id="_x0000_i1343" style="width:0;height:1.5pt" o:hralign="center" o:hrstd="t" o:hr="t" fillcolor="#a0a0a0" stroked="f"/>
+          <v:rect id="_x0000_i1029" style="width:0;height:1.5pt" o:hralign="center" o:hrstd="t" o:hr="t" fillcolor="#a0a0a0" stroked="f"/>
         </w:pict>
       </w:r>
     </w:p>
@@ -3677,7 +3732,6 @@
         <w:rPr>
           <w:lang w:val="en-IN"/>
         </w:rPr>
-        <w:lastRenderedPageBreak/>
         <w:t xml:space="preserve">Software design is the process of </w:t>
       </w:r>
       <w:r>
@@ -3787,7 +3841,7 @@
           <w:lang w:val="en-IN"/>
         </w:rPr>
         <w:pict w14:anchorId="706FDD6D">
-          <v:rect id="_x0000_i1344" style="width:0;height:1.5pt" o:hralign="center" o:hrstd="t" o:hr="t" fillcolor="#a0a0a0" stroked="f"/>
+          <v:rect id="_x0000_i1030" style="width:0;height:1.5pt" o:hralign="center" o:hrstd="t" o:hr="t" fillcolor="#a0a0a0" stroked="f"/>
         </w:pict>
       </w:r>
     </w:p>
@@ -4185,7 +4239,7 @@
           <w:lang w:val="en-IN"/>
         </w:rPr>
         <w:pict w14:anchorId="420ED10D">
-          <v:rect id="_x0000_i1348" style="width:0;height:1.5pt" o:hralign="center" o:hrstd="t" o:hr="t" fillcolor="#a0a0a0" stroked="f"/>
+          <v:rect id="_x0000_i1031" style="width:0;height:1.5pt" o:hralign="center" o:hrstd="t" o:hr="t" fillcolor="#a0a0a0" stroked="f"/>
         </w:pict>
       </w:r>
     </w:p>
@@ -4403,7 +4457,7 @@
           <w:lang w:val="en-IN"/>
         </w:rPr>
         <w:pict w14:anchorId="462EF2EA">
-          <v:rect id="_x0000_i1352" style="width:0;height:1.5pt" o:hralign="center" o:hrstd="t" o:hr="t" fillcolor="#a0a0a0" stroked="f"/>
+          <v:rect id="_x0000_i1032" style="width:0;height:1.5pt" o:hralign="center" o:hrstd="t" o:hr="t" fillcolor="#a0a0a0" stroked="f"/>
         </w:pict>
       </w:r>
     </w:p>
@@ -4439,6 +4493,7 @@
         <w:rPr>
           <w:lang w:val="en-IN"/>
         </w:rPr>
+        <w:lastRenderedPageBreak/>
         <w:t xml:space="preserve">Software architecture defines the </w:t>
       </w:r>
       <w:r>
@@ -4558,7 +4613,6 @@
           <w:bCs/>
           <w:lang w:val="en-IN"/>
         </w:rPr>
-        <w:lastRenderedPageBreak/>
         <w:t>Layered Architecture</w:t>
       </w:r>
     </w:p>
@@ -4829,7 +4883,7 @@
           <w:lang w:val="en-IN"/>
         </w:rPr>
         <w:pict w14:anchorId="714A1DB8">
-          <v:rect id="_x0000_i1356" style="width:0;height:1.5pt" o:hralign="center" o:hrstd="t" o:hr="t" fillcolor="#a0a0a0" stroked="f"/>
+          <v:rect id="_x0000_i1033" style="width:0;height:1.5pt" o:hralign="center" o:hrstd="t" o:hr="t" fillcolor="#a0a0a0" stroked="f"/>
         </w:pict>
       </w:r>
     </w:p>
@@ -4865,14 +4919,12 @@
         </w:rPr>
         <w:t xml:space="preserve">UML (Unified </w:t>
       </w:r>
-      <w:proofErr w:type="spellStart"/>
-      <w:r>
-        <w:rPr>
-          <w:lang w:val="en-IN"/>
-        </w:rPr>
-        <w:t>Modeling</w:t>
-      </w:r>
-      <w:proofErr w:type="spellEnd"/>
+      <w:r>
+        <w:rPr>
+          <w:lang w:val="en-IN"/>
+        </w:rPr>
+        <w:t>Modelling</w:t>
+      </w:r>
       <w:r>
         <w:rPr>
           <w:lang w:val="en-IN"/>
@@ -4906,14 +4958,12 @@
         </w:rPr>
         <w:t xml:space="preserve">UML diagrams help developers understand the structure and </w:t>
       </w:r>
-      <w:proofErr w:type="spellStart"/>
-      <w:r>
-        <w:rPr>
-          <w:lang w:val="en-IN"/>
-        </w:rPr>
-        <w:t>behavior</w:t>
-      </w:r>
-      <w:proofErr w:type="spellEnd"/>
+      <w:r>
+        <w:rPr>
+          <w:lang w:val="en-IN"/>
+        </w:rPr>
+        <w:t>behaviour</w:t>
+      </w:r>
       <w:r>
         <w:rPr>
           <w:lang w:val="en-IN"/>
@@ -5271,65 +5321,38 @@
           <w:lang w:val="en-IN"/>
         </w:rPr>
         <w:br/>
-        <w:t xml:space="preserve">Attributes: </w:t>
-      </w:r>
-      <w:proofErr w:type="spellStart"/>
-      <w:r>
-        <w:rPr>
-          <w:lang w:val="en-IN"/>
-        </w:rPr>
-        <w:t>userID</w:t>
-      </w:r>
-      <w:proofErr w:type="spellEnd"/>
-      <w:r>
-        <w:rPr>
-          <w:lang w:val="en-IN"/>
-        </w:rPr>
-        <w:t>, name</w:t>
+        <w:t>Attributes: userID, name</w:t>
       </w:r>
       <w:r>
         <w:rPr>
           <w:lang w:val="en-IN"/>
         </w:rPr>
         <w:br/>
-        <w:t xml:space="preserve">Methods: </w:t>
-      </w:r>
-      <w:proofErr w:type="gramStart"/>
-      <w:r>
-        <w:rPr>
-          <w:lang w:val="en-IN"/>
-        </w:rPr>
-        <w:t>login(</w:t>
-      </w:r>
-      <w:proofErr w:type="gramEnd"/>
-      <w:r>
-        <w:rPr>
-          <w:lang w:val="en-IN"/>
-        </w:rPr>
-        <w:t>)</w:t>
-      </w:r>
-    </w:p>
-    <w:p>
-      <w:pPr>
-        <w:rPr>
-          <w:lang w:val="en-IN"/>
-        </w:rPr>
-      </w:pPr>
-    </w:p>
-    <w:p>
-      <w:pPr>
-        <w:rPr>
-          <w:b/>
-          <w:bCs/>
-          <w:lang w:val="en-IN"/>
-        </w:rPr>
-      </w:pPr>
-      <w:r>
-        <w:rPr>
-          <w:b/>
-          <w:bCs/>
-          <w:lang w:val="en-IN"/>
-        </w:rPr>
+        <w:t>Methods: login()</w:t>
+      </w:r>
+    </w:p>
+    <w:p>
+      <w:pPr>
+        <w:rPr>
+          <w:lang w:val="en-IN"/>
+        </w:rPr>
+      </w:pPr>
+    </w:p>
+    <w:p>
+      <w:pPr>
+        <w:rPr>
+          <w:b/>
+          <w:bCs/>
+          <w:lang w:val="en-IN"/>
+        </w:rPr>
+      </w:pPr>
+      <w:r>
+        <w:rPr>
+          <w:b/>
+          <w:bCs/>
+          <w:lang w:val="en-IN"/>
+        </w:rPr>
+        <w:lastRenderedPageBreak/>
         <w:t>3. Sequence Diagram</w:t>
       </w:r>
     </w:p>
@@ -5433,7 +5456,6 @@
         <w:rPr>
           <w:lang w:val="en-IN"/>
         </w:rPr>
-        <w:lastRenderedPageBreak/>
         <w:t xml:space="preserve">An Activity Diagram represents the </w:t>
       </w:r>
       <w:r>
@@ -5552,7 +5574,7 @@
           <w:lang w:val="en-IN"/>
         </w:rPr>
         <w:pict w14:anchorId="1BA792FC">
-          <v:rect id="_x0000_i1361" style="width:0;height:1.5pt" o:hralign="center" o:hrstd="t" o:hr="t" fillcolor="#a0a0a0" stroked="f"/>
+          <v:rect id="_x0000_i1034" style="width:0;height:1.5pt" o:hralign="center" o:hrstd="t" o:hr="t" fillcolor="#a0a0a0" stroked="f"/>
         </w:pict>
       </w:r>
     </w:p>
@@ -5599,14 +5621,12 @@
         </w:rPr>
         <w:t xml:space="preserve">. Requirement engineering ensures that the system requirements are correctly understood and documented, while software design transforms these requirements into a structured blueprint. Techniques such as requirement </w:t>
       </w:r>
-      <w:proofErr w:type="spellStart"/>
-      <w:r>
-        <w:rPr>
-          <w:lang w:val="en-IN"/>
-        </w:rPr>
-        <w:t>modeling</w:t>
-      </w:r>
-      <w:proofErr w:type="spellEnd"/>
+      <w:r>
+        <w:rPr>
+          <w:lang w:val="en-IN"/>
+        </w:rPr>
+        <w:t>modelling</w:t>
+      </w:r>
       <w:r>
         <w:rPr>
           <w:lang w:val="en-IN"/>
@@ -14462,6 +14482,7 @@
   <w:style w:type="character" w:default="1" w:styleId="DefaultParagraphFont">
     <w:name w:val="Default Paragraph Font"/>
     <w:uiPriority w:val="1"/>
+    <w:semiHidden/>
     <w:unhideWhenUsed/>
   </w:style>
   <w:style w:type="table" w:default="1" w:styleId="TableNormal">

</xml_diff>